<commit_message>
removed console logging of password
whoops!
</commit_message>
<xml_diff>
--- a/A1 Report - Casey Faggion.docx
+++ b/A1 Report - Casey Faggion.docx
@@ -734,17 +734,50 @@
     </w:p>
     <w:p>
       <w:r>
-        <w:t xml:space="preserve">When this query is excuted, the ‘emailValue’ and ‘passwordValue’ fields are substituted for the user’s values – in this case, the email and password entered by the user. Integrating these values using a combination of a string (the characters within the quotes) and the concatenated values (the values surrounded by ‘+’) creates risk, as if a user passes certain potentially harmful characters, they can break the query and manipulate the database. For example, the user passing in a single quote as the start of </w:t>
+        <w:t>When this query is excuted, the ‘emailValue’ and ‘passwordValue’ fields are substituted</w:t>
+      </w:r>
+      <w:r>
+        <w:t xml:space="preserve"> with</w:t>
+      </w:r>
+      <w:r>
+        <w:t xml:space="preserve"> the user</w:t>
+      </w:r>
+      <w:r>
+        <w:t>-supplied</w:t>
+      </w:r>
+      <w:r>
+        <w:t xml:space="preserve"> values – in this case, the email and password entered by the user. </w:t>
+      </w:r>
+      <w:r>
+        <w:t>In the intended flow, the query would match the supplied email to a matching email in the database (if one is found) and check the user-supplied password to ensure it matched with the password in the database. Using string concatenation – directly inserting the user values with the ‘+’ character – to insert the values</w:t>
+      </w:r>
+      <w:r>
+        <w:t xml:space="preserve"> creates </w:t>
+      </w:r>
+      <w:r>
+        <w:t xml:space="preserve">significant </w:t>
+      </w:r>
+      <w:r>
+        <w:t xml:space="preserve">risk, as </w:t>
+      </w:r>
+      <w:r>
+        <w:t xml:space="preserve">certain characters that have specific functions within SQL queries can be used </w:t>
       </w:r>
       <w:r>
         <w:lastRenderedPageBreak/>
-        <w:t xml:space="preserve">their email would effectively end the string and have the rest of their ‘email’ be treated as actual query code rather than simply a string of characters. </w:t>
+        <w:t>to alter the intended behaviour of the code</w:t>
+      </w:r>
+      <w:r>
+        <w:t xml:space="preserve">. For example, the user passing in a single quote as the start of their email would effectively end the string and have the rest of their ‘email’ be treated as actual query code rather than simply a string of characters. </w:t>
       </w:r>
     </w:p>
     <w:p>
       <w:r>
         <w:tab/>
-        <w:t>Users’ entered email: “ ‘ OR 1=1--  “</w:t>
+        <w:t>Users’ entered email:  ‘ OR 1=1</w:t>
+      </w:r>
+      <w:r>
+        <w:t>--</w:t>
       </w:r>
     </w:p>
     <w:p>
@@ -753,9 +786,6 @@
       </w:r>
     </w:p>
     <w:p>
-      <w:pPr>
-        <w:ind w:left="1440" w:firstLine="45"/>
-      </w:pPr>
       <w:r>
         <w:t>‘</w:t>
       </w:r>
@@ -766,21 +796,36 @@
         <w:t xml:space="preserve">‘ OR 1=1 -- </w:t>
       </w:r>
       <w:r>
-        <w:t>AND password =</w:t>
-      </w:r>
-      <w:r>
-        <w:t xml:space="preserve"> ‘ + passwordValue</w:t>
-      </w:r>
-    </w:p>
-    <w:p>
-      <w:r>
-        <w:t xml:space="preserve">This query would select all of the users from the Customers database table, because the string is ended with the single quote, and a statement that always evaluates to true (1=1 in this case) is used to bypass the check for the users’ email, and the double minus </w:t>
+        <w:rPr>
+          <w:strike/>
+        </w:rPr>
+        <w:t>AND password = ‘ + passwordValue</w:t>
+      </w:r>
+    </w:p>
+    <w:p>
+      <w:r>
+        <w:t>B</w:t>
+      </w:r>
+      <w:r>
+        <w:t>ecause the string is ended with the single quote, and a statement that always evaluates to true (in this case</w:t>
+      </w:r>
+      <w:r>
+        <w:t>, 1=1</w:t>
+      </w:r>
+      <w:r>
+        <w:t xml:space="preserve">) is used to bypass the check for the users’ email, and the double minus </w:t>
       </w:r>
       <w:r>
         <w:t>nullifies</w:t>
       </w:r>
       <w:r>
-        <w:t xml:space="preserve"> the rest of the query, removing the password check.</w:t>
+        <w:t xml:space="preserve"> the remaining code on the line</w:t>
+      </w:r>
+      <w:r>
+        <w:t>, removing the password check.</w:t>
+      </w:r>
+      <w:r>
+        <w:t xml:space="preserve"> This would retrieve the first listed account in the ‘user’ database table, which is often an admin account, as is the case in the Guardian store.</w:t>
       </w:r>
     </w:p>
     <w:p>
@@ -805,7 +850,13 @@
     </w:p>
     <w:p>
       <w:r>
-        <w:t xml:space="preserve">The requests being made to the database to retrieve data are within a  trusted zone; the requests are assumed to not be malicious. However, the issues arises when an untrusted party can pass in data to this trusted request, potentially manipulating it to their own gain. Because the user is able to directly pass in their data into the query, a significant risk arises due to the untrusted data being treated as trusted.  </w:t>
+        <w:t xml:space="preserve">The requests being made to the database to retrieve data are within a  trusted zone; the requests are assumed to not be malicious. However, the issues arises when an untrusted party can pass in data to this trusted request, potentially manipulating it to their own gain. Because the user </w:t>
+      </w:r>
+      <w:r>
+        <w:t>can</w:t>
+      </w:r>
+      <w:r>
+        <w:t xml:space="preserve"> directly pass in their data into the query, a significant risk arises due to the untrusted data being treated as trusted.  </w:t>
       </w:r>
       <w:r>
         <w:t xml:space="preserve"> </w:t>
@@ -817,68 +868,350 @@
         <w:t xml:space="preserve"> </w:t>
       </w:r>
     </w:p>
-    <w:p/>
+    <w:p>
+      <w:r>
+        <w:t xml:space="preserve">Attackers versed in exploiting SQLi vulnerabilities can wreak havoc, gaining access to sensitive personal data, modify or delete data, gain admin privileges, or even crash the server. Having an application suffer any of these attacks can also cause devastating reputational damage to the company. </w:t>
+      </w:r>
+    </w:p>
     <w:p>
       <w:pPr>
         <w:pStyle w:val="Heading2"/>
       </w:pPr>
       <w:bookmarkStart w:id="2" w:name="_Toc210045326"/>
       <w:r>
-        <w:t>Vulnerability Instance</w:t>
+        <w:t xml:space="preserve">Vulnerability </w:t>
+      </w:r>
+      <w:commentRangeStart w:id="3"/>
+      <w:r>
+        <w:t>Instance</w:t>
       </w:r>
       <w:bookmarkEnd w:id="2"/>
-    </w:p>
-    <w:p>
-      <w:r>
-        <w:t>In this Guardian store, the SQL injection vulnerability was present in the search bar and the login process. This exploit was found by attempting to insert a variety of unsafe characters to test if the backend query was directly concatenating the search or login details into the query. For the login section, it could be bypassed by using a single-quote character and two minus signs (‘--). The reason This allows the login to be bypassed is because appending the single quote ends the string and the double minus  effectively removes the rest of the line of code.</w:t>
-      </w:r>
-    </w:p>
-    <w:p>
-      <w:pPr>
-        <w:pStyle w:val="Heading2"/>
-      </w:pPr>
-      <w:bookmarkStart w:id="3" w:name="_Toc210045327"/>
-      <w:commentRangeStart w:id="4"/>
-      <w:r>
-        <w:lastRenderedPageBreak/>
-        <w:t>Remediation</w:t>
-      </w:r>
-      <w:bookmarkEnd w:id="3"/>
-      <w:commentRangeEnd w:id="4"/>
+      <w:commentRangeEnd w:id="3"/>
       <w:r>
         <w:rPr>
           <w:rStyle w:val="CommentReference"/>
           <w:sz w:val="32"/>
           <w:szCs w:val="32"/>
         </w:rPr>
-        <w:commentReference w:id="4"/>
-      </w:r>
-    </w:p>
-    <w:p>
-      <w:r>
-        <w:t xml:space="preserve">Given that this vulnerability most commonly arises because of directly inserting user-entered values, the most </w:t>
-      </w:r>
-      <w:r>
-        <w:t>sensible way to handle it is by not directly inserting it into queries, but instead by using string interpolation and checking the entered information to see if it contains potentially harmful characters.</w:t>
-      </w:r>
-      <w:r>
-        <w:t xml:space="preserve"> The refactoring of the code to instead pass the user-values as a parameter, rather than directly inserting it – is known as query parameterisation.</w:t>
-      </w:r>
-    </w:p>
-    <w:p>
-      <w:r>
-        <w:t>Parameterised queries are an established design pattern for the treatment of SQL injection vulnerabilities, which is the primary factor in the choice to apply it to the Guardian store.</w:t>
+        <w:commentReference w:id="3"/>
+      </w:r>
+    </w:p>
+    <w:p>
+      <w:r>
+        <w:t xml:space="preserve">Any web application feature that requires information to be retrieved from the database will require a query to get the information. Given this information, it can help understand what areas may potentially be vulnerable. In the Guardian store, features like the login flow and search bar require data to be retrieved from the database (note: the register flow may seem like a vulnerability, but this does not ‘get’ information, </w:t>
+      </w:r>
+      <w:r>
+        <w:lastRenderedPageBreak/>
+        <w:t>instead posting information to the database</w:t>
+      </w:r>
+      <w:r>
+        <w:t>, eliminating it as a potential SQLi attack surface</w:t>
+      </w:r>
+      <w:r>
+        <w:t xml:space="preserve">). </w:t>
+      </w:r>
+    </w:p>
+    <w:p>
+      <w:r>
+        <w:t xml:space="preserve">First, the login flow was exploited using a basic attack: ‘ OR 1=1--   </w:t>
+      </w:r>
+      <w:r>
+        <w:br/>
+      </w:r>
+      <w:r>
+        <w:t xml:space="preserve">Inserting this string into the username section of the login </w:t>
+      </w:r>
+      <w:r>
+        <w:t>with any password granted access to the first account in the ‘users’ table in the database, which is the admin account.</w:t>
+      </w:r>
+      <w:r>
+        <w:t xml:space="preserve"> The ability to gain access to the Guardian admin account with the most basic of SQLi attacks reveals how severe the vulnerability is, and the potential damage inflicted by a malicious agent.</w:t>
+      </w:r>
+      <w:r>
+        <w:t xml:space="preserve"> Reviewing the source code, the query is notably like the example used in the previous report section:</w:t>
+      </w:r>
+    </w:p>
+    <w:p>
+      <w:r>
+        <w:drawing>
+          <wp:inline distT="0" distB="0" distL="0" distR="0" wp14:anchorId="45EDE926" wp14:editId="1F1D8A47">
+            <wp:extent cx="5731510" cy="263525"/>
+            <wp:effectExtent l="0" t="0" r="2540" b="3175"/>
+            <wp:docPr id="1912368986" name="Picture 1"/>
+            <wp:cNvGraphicFramePr>
+              <a:graphicFrameLocks xmlns:a="http://schemas.openxmlformats.org/drawingml/2006/main" noChangeAspect="1"/>
+            </wp:cNvGraphicFramePr>
+            <a:graphic xmlns:a="http://schemas.openxmlformats.org/drawingml/2006/main">
+              <a:graphicData uri="http://schemas.openxmlformats.org/drawingml/2006/picture">
+                <pic:pic xmlns:pic="http://schemas.openxmlformats.org/drawingml/2006/picture">
+                  <pic:nvPicPr>
+                    <pic:cNvPr id="1912368986" name=""/>
+                    <pic:cNvPicPr/>
+                  </pic:nvPicPr>
+                  <pic:blipFill>
+                    <a:blip r:embed="rId9"/>
+                    <a:stretch>
+                      <a:fillRect/>
+                    </a:stretch>
+                  </pic:blipFill>
+                  <pic:spPr>
+                    <a:xfrm>
+                      <a:off x="0" y="0"/>
+                      <a:ext cx="5731510" cy="263525"/>
+                    </a:xfrm>
+                    <a:prstGeom prst="rect">
+                      <a:avLst/>
+                    </a:prstGeom>
+                  </pic:spPr>
+                </pic:pic>
+              </a:graphicData>
+            </a:graphic>
+          </wp:inline>
+        </w:drawing>
+      </w:r>
+      <w:r>
+        <w:t>While it does not directly use string concatenation, it uses a format string that instead uses the ‘${}’ markers to determine where user values are inserted, presenting the same vulnerability.</w:t>
+      </w:r>
+    </w:p>
+    <w:p>
+      <w:r>
+        <w:t xml:space="preserve">Moving to the search bar, the second obvious attack surface, it was probed using some more basic SQLi payloads to help understand how queries were handled on the backend. While the search bar does not reveal any potential vulnerabilities by inserting payloads directly into the search bar, </w:t>
+      </w:r>
+      <w:r>
+        <w:t>instead inserting the payload string “’;” directly into the REST URL request (</w:t>
+      </w:r>
+      <w:r>
+        <w:t>http://localhost:3000/rest/products/search?q=';</w:t>
+      </w:r>
+      <w:r>
+        <w:t>) reveals an error:</w:t>
+      </w:r>
+      <w:r>
+        <w:t xml:space="preserve"> </w:t>
+      </w:r>
+    </w:p>
+    <w:p>
+      <w:r>
+        <w:rPr>
+          <w:noProof/>
+        </w:rPr>
+        <w:drawing>
+          <wp:inline distT="0" distB="0" distL="0" distR="0" wp14:anchorId="24C36608" wp14:editId="6EAFBA15">
+            <wp:extent cx="3990975" cy="1477271"/>
+            <wp:effectExtent l="0" t="0" r="0" b="8890"/>
+            <wp:docPr id="238934520" name="Picture 1" descr="SQL search query syntax error"/>
+            <wp:cNvGraphicFramePr>
+              <a:graphicFrameLocks xmlns:a="http://schemas.openxmlformats.org/drawingml/2006/main" noChangeAspect="1"/>
+            </wp:cNvGraphicFramePr>
+            <a:graphic xmlns:a="http://schemas.openxmlformats.org/drawingml/2006/main">
+              <a:graphicData uri="http://schemas.openxmlformats.org/drawingml/2006/picture">
+                <pic:pic xmlns:pic="http://schemas.openxmlformats.org/drawingml/2006/picture">
+                  <pic:nvPicPr>
+                    <pic:cNvPr id="0" name="Picture 1" descr="SQL search query syntax error"/>
+                    <pic:cNvPicPr>
+                      <a:picLocks noChangeAspect="1" noChangeArrowheads="1"/>
+                    </pic:cNvPicPr>
+                  </pic:nvPicPr>
+                  <pic:blipFill>
+                    <a:blip r:embed="rId10" cstate="print">
+                      <a:extLst>
+                        <a:ext uri="{28A0092B-C50C-407E-A947-70E740481C1C}">
+                          <a14:useLocalDpi xmlns:a14="http://schemas.microsoft.com/office/drawing/2010/main" val="0"/>
+                        </a:ext>
+                      </a:extLst>
+                    </a:blip>
+                    <a:srcRect/>
+                    <a:stretch>
+                      <a:fillRect/>
+                    </a:stretch>
+                  </pic:blipFill>
+                  <pic:spPr bwMode="auto">
+                    <a:xfrm>
+                      <a:off x="0" y="0"/>
+                      <a:ext cx="4001402" cy="1481131"/>
+                    </a:xfrm>
+                    <a:prstGeom prst="rect">
+                      <a:avLst/>
+                    </a:prstGeom>
+                    <a:noFill/>
+                    <a:ln>
+                      <a:noFill/>
+                    </a:ln>
+                  </pic:spPr>
+                </pic:pic>
+              </a:graphicData>
+            </a:graphic>
+          </wp:inline>
+        </w:drawing>
+      </w:r>
+      <w:r>
+        <w:t>\</w:t>
+      </w:r>
+    </w:p>
+    <w:p>
+      <w:r>
+        <w:t xml:space="preserve">This error being returned indicates that ‘blind’ SQLi attacks are possible, meaning crafting an effective payload only requires reading the error and some persistence. Attempting to use a different character string – “’--  “ produces a new error: </w:t>
+      </w:r>
+      <w:r>
+        <w:rPr>
+          <w:i/>
+          <w:iCs/>
+        </w:rPr>
+        <w:t>SQLITE_ERROR: Incomplete input</w:t>
+      </w:r>
+      <w:r>
+        <w:rPr>
+          <w:i/>
+          <w:iCs/>
+        </w:rPr>
+        <w:t xml:space="preserve">. </w:t>
+      </w:r>
+      <w:r>
+        <w:t>Some more probing reveals that inserting “’))—” retrieves all products, including deleted products, and allows the user to add them to the basket and purchase them.</w:t>
+      </w:r>
+    </w:p>
+    <w:p>
+      <w:r>
+        <w:t>Reviewing the source code to reveals this:</w:t>
+      </w:r>
+    </w:p>
+    <w:p>
+      <w:r>
+        <w:drawing>
+          <wp:inline distT="0" distB="0" distL="0" distR="0" wp14:anchorId="6D9ABAD5" wp14:editId="63FE7603">
+            <wp:extent cx="5115639" cy="409632"/>
+            <wp:effectExtent l="0" t="0" r="8890" b="9525"/>
+            <wp:docPr id="1572322688" name="Picture 1"/>
+            <wp:cNvGraphicFramePr>
+              <a:graphicFrameLocks xmlns:a="http://schemas.openxmlformats.org/drawingml/2006/main" noChangeAspect="1"/>
+            </wp:cNvGraphicFramePr>
+            <a:graphic xmlns:a="http://schemas.openxmlformats.org/drawingml/2006/main">
+              <a:graphicData uri="http://schemas.openxmlformats.org/drawingml/2006/picture">
+                <pic:pic xmlns:pic="http://schemas.openxmlformats.org/drawingml/2006/picture">
+                  <pic:nvPicPr>
+                    <pic:cNvPr id="1572322688" name=""/>
+                    <pic:cNvPicPr/>
+                  </pic:nvPicPr>
+                  <pic:blipFill>
+                    <a:blip r:embed="rId11"/>
+                    <a:stretch>
+                      <a:fillRect/>
+                    </a:stretch>
+                  </pic:blipFill>
+                  <pic:spPr>
+                    <a:xfrm>
+                      <a:off x="0" y="0"/>
+                      <a:ext cx="5115639" cy="409632"/>
+                    </a:xfrm>
+                    <a:prstGeom prst="rect">
+                      <a:avLst/>
+                    </a:prstGeom>
+                  </pic:spPr>
+                </pic:pic>
+              </a:graphicData>
+            </a:graphic>
+          </wp:inline>
+        </w:drawing>
+      </w:r>
+    </w:p>
+    <w:p>
+      <w:r>
+        <w:lastRenderedPageBreak/>
+        <w:t>A retrieval query essentially the same as the login query. While the ability to retrieve and buy deleted objects may not at first seem like a severe issue, a more experienced attacker can leverage weaknesses like there to significant gain, such as database exfiltration or even deleting entire database tables.</w:t>
       </w:r>
     </w:p>
     <w:p>
       <w:pPr>
         <w:pStyle w:val="Heading2"/>
       </w:pPr>
-      <w:bookmarkStart w:id="5" w:name="_Toc210045328"/>
+      <w:bookmarkStart w:id="4" w:name="_Toc210045327"/>
+      <w:commentRangeStart w:id="5"/>
+      <w:r>
+        <w:t>Remediation</w:t>
+      </w:r>
+      <w:bookmarkEnd w:id="4"/>
+      <w:commentRangeEnd w:id="5"/>
+      <w:r>
+        <w:rPr>
+          <w:rStyle w:val="CommentReference"/>
+          <w:sz w:val="32"/>
+          <w:szCs w:val="32"/>
+        </w:rPr>
+        <w:commentReference w:id="5"/>
+      </w:r>
+    </w:p>
+    <w:p>
+      <w:r>
+        <w:t xml:space="preserve">Given the long history of SQLi attacks, several design patterns have arisen to combat it. One of the most prevalent is parameterised queries, where user-values are inserted as parameters, rather than directly </w:t>
+      </w:r>
+      <w:r>
+        <w:t>inserting them into a query. Refactoring the login flow to implement this pattern looks like this:</w:t>
+      </w:r>
+    </w:p>
+    <w:p>
+      <w:r>
+        <w:drawing>
+          <wp:inline distT="0" distB="0" distL="0" distR="0" wp14:anchorId="0D2F1F63" wp14:editId="0069873C">
+            <wp:extent cx="5731510" cy="1868170"/>
+            <wp:effectExtent l="0" t="0" r="2540" b="0"/>
+            <wp:docPr id="13254571" name="Picture 1" descr="A screen shot of a computer&#10;&#10;AI-generated content may be incorrect."/>
+            <wp:cNvGraphicFramePr>
+              <a:graphicFrameLocks xmlns:a="http://schemas.openxmlformats.org/drawingml/2006/main" noChangeAspect="1"/>
+            </wp:cNvGraphicFramePr>
+            <a:graphic xmlns:a="http://schemas.openxmlformats.org/drawingml/2006/main">
+              <a:graphicData uri="http://schemas.openxmlformats.org/drawingml/2006/picture">
+                <pic:pic xmlns:pic="http://schemas.openxmlformats.org/drawingml/2006/picture">
+                  <pic:nvPicPr>
+                    <pic:cNvPr id="13254571" name="Picture 1" descr="A screen shot of a computer&#10;&#10;AI-generated content may be incorrect."/>
+                    <pic:cNvPicPr/>
+                  </pic:nvPicPr>
+                  <pic:blipFill>
+                    <a:blip r:embed="rId12"/>
+                    <a:stretch>
+                      <a:fillRect/>
+                    </a:stretch>
+                  </pic:blipFill>
+                  <pic:spPr>
+                    <a:xfrm>
+                      <a:off x="0" y="0"/>
+                      <a:ext cx="5731510" cy="1868170"/>
+                    </a:xfrm>
+                    <a:prstGeom prst="rect">
+                      <a:avLst/>
+                    </a:prstGeom>
+                  </pic:spPr>
+                </pic:pic>
+              </a:graphicData>
+            </a:graphic>
+          </wp:inline>
+        </w:drawing>
+      </w:r>
+    </w:p>
+    <w:p>
+      <w:r>
+        <w:t xml:space="preserve">Given that this vulnerability most commonly arises because of directly inserting user-entered values, the most </w:t>
+      </w:r>
+      <w:r>
+        <w:t>sensible way to handle it is by not directly inserting it into queries, but instead by using string interpolation and checking the entered information to see if it contains potentially harmful characters.</w:t>
+      </w:r>
+      <w:r>
+        <w:t xml:space="preserve"> The refactoring of the code to instead pass the user-values as a parameter, rather than directly inserting it – is known as query parameterisation.</w:t>
+      </w:r>
+    </w:p>
+    <w:p>
+      <w:r>
+        <w:t>Parameterised queries are an established design pattern for the treatment of SQL injection vulnerabilities, which is the primary factor in the choice to apply it to the Guardian store.</w:t>
+      </w:r>
+    </w:p>
+    <w:p>
+      <w:pPr>
+        <w:pStyle w:val="Heading2"/>
+      </w:pPr>
+      <w:bookmarkStart w:id="6" w:name="_Toc210045328"/>
       <w:r>
         <w:t>Automated security testing</w:t>
       </w:r>
-      <w:bookmarkEnd w:id="5"/>
+      <w:bookmarkEnd w:id="6"/>
     </w:p>
     <w:p>
       <w:r>
@@ -893,7 +1226,11 @@
         <w:t xml:space="preserve">SAST </w:t>
       </w:r>
       <w:r>
-        <w:t xml:space="preserve">scans the application in a non-running state, analysing the source code, dependencies, and byte code for vulnerabilities in the software dependencies, user input, and backdoors. This form of testing is typically leveraged during the early stages of development.  DAST tests </w:t>
+        <w:t xml:space="preserve">scans the application in a non-running state, analysing the source code, dependencies, and byte code for vulnerabilities in the software dependencies, user input, and backdoors. This form of testing is typically leveraged during the early stages </w:t>
+      </w:r>
+      <w:r>
+        <w:lastRenderedPageBreak/>
+        <w:t xml:space="preserve">of development.  DAST tests </w:t>
       </w:r>
       <w:r>
         <w:t xml:space="preserve">the application in a running state, simulating attacks against the applications, attempting to find weaknesses in run-time, like session management, cookies, and SQL injection. DAST excels at testing application resilience in </w:t>
@@ -922,11 +1259,13 @@
         <w:t xml:space="preserve">to reliably deploy software without crippling team workflows or application security. Thus, automated testing tools have become prevalent among software developers due to their ability to scale production, maintaining consistent testing as systems grow more complex and more interconnected. Additionally, automated testing bypasses the need for specialised </w:t>
       </w:r>
       <w:r>
-        <w:t xml:space="preserve">experts, creating more consistent results because the tester’s skill is no longer a factor, </w:t>
-      </w:r>
-      <w:r>
-        <w:lastRenderedPageBreak/>
-        <w:t xml:space="preserve">and hastens testing by integrating it into the development pipeline and producing results significantly faster than manual testing. </w:t>
+        <w:t xml:space="preserve">experts, creating more consistent results because the tester’s skill is no longer a factor, and </w:t>
+      </w:r>
+      <w:r>
+        <w:t>CI/CD integration</w:t>
+      </w:r>
+      <w:r>
+        <w:t xml:space="preserve"> results significantly faster than manual testing. </w:t>
       </w:r>
     </w:p>
     <w:p>
@@ -963,7 +1302,7 @@
                     </pic:cNvPicPr>
                   </pic:nvPicPr>
                   <pic:blipFill>
-                    <a:blip r:embed="rId9">
+                    <a:blip r:embed="rId13">
                       <a:extLst>
                         <a:ext uri="{28A0092B-C50C-407E-A947-70E740481C1C}">
                           <a14:useLocalDpi xmlns:a14="http://schemas.microsoft.com/office/drawing/2010/main" val="0"/>
@@ -997,9 +1336,10 @@
     </w:p>
     <w:p>
       <w:r>
+        <w:lastRenderedPageBreak/>
         <w:t xml:space="preserve">(Fig. 1, </w:t>
       </w:r>
-      <w:hyperlink r:id="rId10" w:history="1">
+      <w:hyperlink r:id="rId14" w:history="1">
         <w:r>
           <w:rPr>
             <w:rStyle w:val="Hyperlink"/>
@@ -1016,12 +1356,23 @@
         <w:t xml:space="preserve">Given this report’s focus on SQLi, </w:t>
       </w:r>
       <w:r>
-        <w:t>SQLMap was an appropriate choice given its focus on testing the security of SQL queries.</w:t>
-      </w:r>
-    </w:p>
-    <w:p>
-      <w:r>
-        <w:lastRenderedPageBreak/>
+        <w:t>sqlmap</w:t>
+      </w:r>
+      <w:r>
+        <w:t xml:space="preserve"> was an appropriate choice </w:t>
+      </w:r>
+      <w:r>
+        <w:t xml:space="preserve">because it is a tool specialised for detecting and exploiting SQLi vulnerabilities, including the ability to automate its usage into the SDLC. While there are several tools available that can scan for SQLi, sqlmap can scan almost all varieties of relational databases, and tests using several different injection techniques like UNION queries; Boolean-based blinds; error-based; and several others. </w:t>
+      </w:r>
+      <w:r>
+        <w:t xml:space="preserve">This variety of exploitation techniques </w:t>
+      </w:r>
+    </w:p>
+    <w:p>
+      <w:r>
+        <w:rPr>
+          <w:noProof/>
+        </w:rPr>
         <w:drawing>
           <wp:inline distT="0" distB="0" distL="0" distR="0" wp14:anchorId="6E8E67A5" wp14:editId="689E8F12">
             <wp:extent cx="5731510" cy="6512560"/>
@@ -1038,7 +1389,7 @@
                     <pic:cNvPicPr/>
                   </pic:nvPicPr>
                   <pic:blipFill>
-                    <a:blip r:embed="rId11"/>
+                    <a:blip r:embed="rId15"/>
                     <a:stretch>
                       <a:fillRect/>
                     </a:stretch>
@@ -1063,21 +1414,22 @@
       <w:pPr>
         <w:pStyle w:val="Heading2"/>
       </w:pPr>
-      <w:bookmarkStart w:id="6" w:name="_Toc210045329"/>
-      <w:r>
+      <w:bookmarkStart w:id="7" w:name="_Toc210045329"/>
+      <w:r>
+        <w:lastRenderedPageBreak/>
         <w:t>Recommendations</w:t>
       </w:r>
-      <w:bookmarkEnd w:id="6"/>
+      <w:bookmarkEnd w:id="7"/>
     </w:p>
     <w:p>
       <w:pPr>
         <w:pStyle w:val="Heading2"/>
       </w:pPr>
-      <w:bookmarkStart w:id="7" w:name="_Toc210045330"/>
+      <w:bookmarkStart w:id="8" w:name="_Toc210045330"/>
       <w:r>
         <w:t>Conclusion</w:t>
       </w:r>
-      <w:bookmarkEnd w:id="7"/>
+      <w:bookmarkEnd w:id="8"/>
     </w:p>
     <w:p>
       <w:r>
@@ -1088,14 +1440,14 @@
       <w:pPr>
         <w:pStyle w:val="Heading2"/>
       </w:pPr>
-      <w:bookmarkStart w:id="8" w:name="_Toc210045331"/>
+      <w:bookmarkStart w:id="9" w:name="_Toc210045331"/>
       <w:r>
         <w:t>References</w:t>
       </w:r>
-      <w:bookmarkEnd w:id="8"/>
-    </w:p>
-    <w:p>
-      <w:hyperlink r:id="rId12" w:history="1">
+      <w:bookmarkEnd w:id="9"/>
+    </w:p>
+    <w:p>
+      <w:hyperlink r:id="rId16" w:history="1">
         <w:r>
           <w:rPr>
             <w:rStyle w:val="Hyperlink"/>
@@ -1105,7 +1457,7 @@
       </w:hyperlink>
     </w:p>
     <w:p>
-      <w:hyperlink r:id="rId13" w:history="1">
+      <w:hyperlink r:id="rId17" w:history="1">
         <w:r>
           <w:rPr>
             <w:rStyle w:val="Hyperlink"/>
@@ -1114,7 +1466,21 @@
         </w:r>
       </w:hyperlink>
     </w:p>
-    <w:p/>
+    <w:p>
+      <w:hyperlink r:id="rId18" w:history="1">
+        <w:r>
+          <w:rPr>
+            <w:rStyle w:val="Hyperlink"/>
+          </w:rPr>
+          <w:t>https://sqlmap.org/</w:t>
+        </w:r>
+      </w:hyperlink>
+    </w:p>
+    <w:p>
+      <w:r>
+        <w:t>https://www.geeksforgeeks.org/sql/sql-injection/</w:t>
+      </w:r>
+    </w:p>
     <w:sectPr>
       <w:pgSz w:w="11906" w:h="16838"/>
       <w:pgMar w:top="1440" w:right="1440" w:bottom="1440" w:left="1440" w:header="708" w:footer="708" w:gutter="0"/>
@@ -1127,7 +1493,23 @@
 
 <file path=word/comments.xml><?xml version="1.0" encoding="utf-8"?>
 <w:comments xmlns:wpc="http://schemas.microsoft.com/office/word/2010/wordprocessingCanvas" xmlns:cx="http://schemas.microsoft.com/office/drawing/2014/chartex" xmlns:cx1="http://schemas.microsoft.com/office/drawing/2015/9/8/chartex" xmlns:cx2="http://schemas.microsoft.com/office/drawing/2015/10/21/chartex" xmlns:cx3="http://schemas.microsoft.com/office/drawing/2016/5/9/chartex" xmlns:cx4="http://schemas.microsoft.com/office/drawing/2016/5/10/chartex" xmlns:cx5="http://schemas.microsoft.com/office/drawing/2016/5/11/chartex" xmlns:cx6="http://schemas.microsoft.com/office/drawing/2016/5/12/chartex" xmlns:cx7="http://schemas.microsoft.com/office/drawing/2016/5/13/chartex" xmlns:cx8="http://schemas.microsoft.com/office/drawing/2016/5/14/chartex" xmlns:mc="http://schemas.openxmlformats.org/markup-compatibility/2006" xmlns:aink="http://schemas.microsoft.com/office/drawing/2016/ink" xmlns:am3d="http://schemas.microsoft.com/office/drawing/2017/model3d" xmlns:o="urn:schemas-microsoft-com:office:office" xmlns:oel="http://schemas.microsoft.com/office/2019/extlst" xmlns:r="http://schemas.openxmlformats.org/officeDocument/2006/relationships" xmlns:m="http://schemas.openxmlformats.org/officeDocument/2006/math" xmlns:v="urn:schemas-microsoft-com:vml" xmlns:wp14="http://schemas.microsoft.com/office/word/2010/wordprocessingDrawing" xmlns:wp="http://schemas.openxmlformats.org/drawingml/2006/wordprocessingDrawing" xmlns:w10="urn:schemas-microsoft-com:office:word" xmlns:w="http://schemas.openxmlformats.org/wordprocessingml/2006/main" xmlns:w14="http://schemas.microsoft.com/office/word/2010/wordml" xmlns:w15="http://schemas.microsoft.com/office/word/2012/wordml" xmlns:w16cex="http://schemas.microsoft.com/office/word/2018/wordml/cex" xmlns:w16cid="http://schemas.microsoft.com/office/word/2016/wordml/cid" xmlns:w16="http://schemas.microsoft.com/office/word/2018/wordml" xmlns:w16du="http://schemas.microsoft.com/office/word/2023/wordml/word16du" xmlns:w16sdtdh="http://schemas.microsoft.com/office/word/2020/wordml/sdtdatahash" xmlns:w16sdtfl="http://schemas.microsoft.com/office/word/2024/wordml/sdtformatlock" xmlns:w16se="http://schemas.microsoft.com/office/word/2015/wordml/symex" xmlns:wpg="http://schemas.microsoft.com/office/word/2010/wordprocessingGroup" xmlns:wpi="http://schemas.microsoft.com/office/word/2010/wordprocessingInk" xmlns:wne="http://schemas.microsoft.com/office/word/2006/wordml" xmlns:wps="http://schemas.microsoft.com/office/word/2010/wordprocessingShape" mc:Ignorable="w14 w15 w16se w16cid w16 w16cex w16sdtdh w16sdtfl w16du wp14">
-  <w:comment w:id="4" w:author="Faggion, Casey Kieboom - fagck001" w:date="2025-10-22T20:44:00Z" w:initials="CF">
+  <w:comment w:id="3" w:author="Faggion, Casey Kieboom - fagck001" w:date="2025-11-05T16:12:00Z" w:initials="CF">
+    <w:p>
+      <w:pPr>
+        <w:pStyle w:val="CommentText"/>
+      </w:pPr>
+      <w:r>
+        <w:rPr>
+          <w:rStyle w:val="CommentReference"/>
+        </w:rPr>
+        <w:annotationRef/>
+      </w:r>
+      <w:r>
+        <w:t>elaborate</w:t>
+      </w:r>
+    </w:p>
+  </w:comment>
+  <w:comment w:id="5" w:author="Faggion, Casey Kieboom - fagck001" w:date="2025-10-22T20:44:00Z" w:initials="CF">
     <w:p>
       <w:pPr>
         <w:pStyle w:val="CommentText"/>
@@ -1148,18 +1530,21 @@
 
 <file path=word/commentsExtended.xml><?xml version="1.0" encoding="utf-8"?>
 <w15:commentsEx xmlns:wpc="http://schemas.microsoft.com/office/word/2010/wordprocessingCanvas" xmlns:cx="http://schemas.microsoft.com/office/drawing/2014/chartex" xmlns:cx1="http://schemas.microsoft.com/office/drawing/2015/9/8/chartex" xmlns:cx2="http://schemas.microsoft.com/office/drawing/2015/10/21/chartex" xmlns:cx3="http://schemas.microsoft.com/office/drawing/2016/5/9/chartex" xmlns:cx4="http://schemas.microsoft.com/office/drawing/2016/5/10/chartex" xmlns:cx5="http://schemas.microsoft.com/office/drawing/2016/5/11/chartex" xmlns:cx6="http://schemas.microsoft.com/office/drawing/2016/5/12/chartex" xmlns:cx7="http://schemas.microsoft.com/office/drawing/2016/5/13/chartex" xmlns:cx8="http://schemas.microsoft.com/office/drawing/2016/5/14/chartex" xmlns:mc="http://schemas.openxmlformats.org/markup-compatibility/2006" xmlns:aink="http://schemas.microsoft.com/office/drawing/2016/ink" xmlns:am3d="http://schemas.microsoft.com/office/drawing/2017/model3d" xmlns:o="urn:schemas-microsoft-com:office:office" xmlns:oel="http://schemas.microsoft.com/office/2019/extlst" xmlns:r="http://schemas.openxmlformats.org/officeDocument/2006/relationships" xmlns:m="http://schemas.openxmlformats.org/officeDocument/2006/math" xmlns:v="urn:schemas-microsoft-com:vml" xmlns:wp14="http://schemas.microsoft.com/office/word/2010/wordprocessingDrawing" xmlns:wp="http://schemas.openxmlformats.org/drawingml/2006/wordprocessingDrawing" xmlns:w10="urn:schemas-microsoft-com:office:word" xmlns:w="http://schemas.openxmlformats.org/wordprocessingml/2006/main" xmlns:w14="http://schemas.microsoft.com/office/word/2010/wordml" xmlns:w15="http://schemas.microsoft.com/office/word/2012/wordml" xmlns:w16cex="http://schemas.microsoft.com/office/word/2018/wordml/cex" xmlns:w16cid="http://schemas.microsoft.com/office/word/2016/wordml/cid" xmlns:w16="http://schemas.microsoft.com/office/word/2018/wordml" xmlns:w16du="http://schemas.microsoft.com/office/word/2023/wordml/word16du" xmlns:w16sdtdh="http://schemas.microsoft.com/office/word/2020/wordml/sdtdatahash" xmlns:w16sdtfl="http://schemas.microsoft.com/office/word/2024/wordml/sdtformatlock" xmlns:w16se="http://schemas.microsoft.com/office/word/2015/wordml/symex" xmlns:wpg="http://schemas.microsoft.com/office/word/2010/wordprocessingGroup" xmlns:wpi="http://schemas.microsoft.com/office/word/2010/wordprocessingInk" xmlns:wne="http://schemas.microsoft.com/office/word/2006/wordml" xmlns:wps="http://schemas.microsoft.com/office/word/2010/wordprocessingShape" mc:Ignorable="w14 w15 w16se w16cid w16 w16cex w16sdtdh w16sdtfl w16du wp14">
+  <w15:commentEx w15:paraId="127E0F2E" w15:done="0"/>
   <w15:commentEx w15:paraId="02F89BE9" w15:done="0"/>
 </w15:commentsEx>
 </file>
 
 <file path=word/commentsExtensible.xml><?xml version="1.0" encoding="utf-8"?>
 <w16cex:commentsExtensible xmlns:wpc="http://schemas.microsoft.com/office/word/2010/wordprocessingCanvas" xmlns:cx="http://schemas.microsoft.com/office/drawing/2014/chartex" xmlns:cx1="http://schemas.microsoft.com/office/drawing/2015/9/8/chartex" xmlns:cx2="http://schemas.microsoft.com/office/drawing/2015/10/21/chartex" xmlns:cx3="http://schemas.microsoft.com/office/drawing/2016/5/9/chartex" xmlns:cx4="http://schemas.microsoft.com/office/drawing/2016/5/10/chartex" xmlns:cx5="http://schemas.microsoft.com/office/drawing/2016/5/11/chartex" xmlns:cx6="http://schemas.microsoft.com/office/drawing/2016/5/12/chartex" xmlns:cx7="http://schemas.microsoft.com/office/drawing/2016/5/13/chartex" xmlns:cx8="http://schemas.microsoft.com/office/drawing/2016/5/14/chartex" xmlns:cr="http://schemas.microsoft.com/office/comments/2020/reactions" xmlns:mc="http://schemas.openxmlformats.org/markup-compatibility/2006" xmlns:aink="http://schemas.microsoft.com/office/drawing/2016/ink" xmlns:am3d="http://schemas.microsoft.com/office/drawing/2017/model3d" xmlns:o="urn:schemas-microsoft-com:office:office" xmlns:oel="http://schemas.microsoft.com/office/2019/extlst" xmlns:r="http://schemas.openxmlformats.org/officeDocument/2006/relationships" xmlns:m="http://schemas.openxmlformats.org/officeDocument/2006/math" xmlns:v="urn:schemas-microsoft-com:vml" xmlns:wp14="http://schemas.microsoft.com/office/word/2010/wordprocessingDrawing" xmlns:wp="http://schemas.openxmlformats.org/drawingml/2006/wordprocessingDrawing" xmlns:w10="urn:schemas-microsoft-com:office:word" xmlns:w="http://schemas.openxmlformats.org/wordprocessingml/2006/main" xmlns:w14="http://schemas.microsoft.com/office/word/2010/wordml" xmlns:w15="http://schemas.microsoft.com/office/word/2012/wordml" xmlns:w16cex="http://schemas.microsoft.com/office/word/2018/wordml/cex" xmlns:w16cid="http://schemas.microsoft.com/office/word/2016/wordml/cid" xmlns:w16="http://schemas.microsoft.com/office/word/2018/wordml" xmlns:w16du="http://schemas.microsoft.com/office/word/2023/wordml/word16du" xmlns:w16sdtdh="http://schemas.microsoft.com/office/word/2020/wordml/sdtdatahash" xmlns:w16sdtfl="http://schemas.microsoft.com/office/word/2024/wordml/sdtformatlock" xmlns:w16se="http://schemas.microsoft.com/office/word/2015/wordml/symex" xmlns:wpg="http://schemas.microsoft.com/office/word/2010/wordprocessingGroup" xmlns:wpi="http://schemas.microsoft.com/office/word/2010/wordprocessingInk" xmlns:wne="http://schemas.microsoft.com/office/word/2006/wordml" xmlns:wps="http://schemas.microsoft.com/office/word/2010/wordprocessingShape" mc:Ignorable="w14 w15 w16se w16cid w16 w16cex w16sdtdh w16sdtfl cr w16du wp14">
+  <w16cex:commentExtensible w16cex:durableId="23A2686F" w16cex:dateUtc="2025-11-05T05:42:00Z"/>
   <w16cex:commentExtensible w16cex:durableId="701280E4" w16cex:dateUtc="2025-10-22T10:14:00Z"/>
 </w16cex:commentsExtensible>
 </file>
 
 <file path=word/commentsIds.xml><?xml version="1.0" encoding="utf-8"?>
 <w16cid:commentsIds xmlns:wpc="http://schemas.microsoft.com/office/word/2010/wordprocessingCanvas" xmlns:cx="http://schemas.microsoft.com/office/drawing/2014/chartex" xmlns:cx1="http://schemas.microsoft.com/office/drawing/2015/9/8/chartex" xmlns:cx2="http://schemas.microsoft.com/office/drawing/2015/10/21/chartex" xmlns:cx3="http://schemas.microsoft.com/office/drawing/2016/5/9/chartex" xmlns:cx4="http://schemas.microsoft.com/office/drawing/2016/5/10/chartex" xmlns:cx5="http://schemas.microsoft.com/office/drawing/2016/5/11/chartex" xmlns:cx6="http://schemas.microsoft.com/office/drawing/2016/5/12/chartex" xmlns:cx7="http://schemas.microsoft.com/office/drawing/2016/5/13/chartex" xmlns:cx8="http://schemas.microsoft.com/office/drawing/2016/5/14/chartex" xmlns:mc="http://schemas.openxmlformats.org/markup-compatibility/2006" xmlns:aink="http://schemas.microsoft.com/office/drawing/2016/ink" xmlns:am3d="http://schemas.microsoft.com/office/drawing/2017/model3d" xmlns:o="urn:schemas-microsoft-com:office:office" xmlns:oel="http://schemas.microsoft.com/office/2019/extlst" xmlns:r="http://schemas.openxmlformats.org/officeDocument/2006/relationships" xmlns:m="http://schemas.openxmlformats.org/officeDocument/2006/math" xmlns:v="urn:schemas-microsoft-com:vml" xmlns:wp14="http://schemas.microsoft.com/office/word/2010/wordprocessingDrawing" xmlns:wp="http://schemas.openxmlformats.org/drawingml/2006/wordprocessingDrawing" xmlns:w10="urn:schemas-microsoft-com:office:word" xmlns:w="http://schemas.openxmlformats.org/wordprocessingml/2006/main" xmlns:w14="http://schemas.microsoft.com/office/word/2010/wordml" xmlns:w15="http://schemas.microsoft.com/office/word/2012/wordml" xmlns:w16cex="http://schemas.microsoft.com/office/word/2018/wordml/cex" xmlns:w16cid="http://schemas.microsoft.com/office/word/2016/wordml/cid" xmlns:w16="http://schemas.microsoft.com/office/word/2018/wordml" xmlns:w16du="http://schemas.microsoft.com/office/word/2023/wordml/word16du" xmlns:w16sdtdh="http://schemas.microsoft.com/office/word/2020/wordml/sdtdatahash" xmlns:w16sdtfl="http://schemas.microsoft.com/office/word/2024/wordml/sdtformatlock" xmlns:w16se="http://schemas.microsoft.com/office/word/2015/wordml/symex" xmlns:wpg="http://schemas.microsoft.com/office/word/2010/wordprocessingGroup" xmlns:wpi="http://schemas.microsoft.com/office/word/2010/wordprocessingInk" xmlns:wne="http://schemas.microsoft.com/office/word/2006/wordml" xmlns:wps="http://schemas.microsoft.com/office/word/2010/wordprocessingShape" mc:Ignorable="w14 w15 w16se w16cid w16 w16cex w16sdtdh w16sdtfl w16du wp14">
+  <w16cid:commentId w16cid:paraId="127E0F2E" w16cid:durableId="23A2686F"/>
   <w16cid:commentId w16cid:paraId="02F89BE9" w16cid:durableId="701280E4"/>
 </w16cid:commentsIds>
 </file>
@@ -1774,7 +2159,6 @@
   <w:style w:type="character" w:default="1" w:styleId="DefaultParagraphFont">
     <w:name w:val="Default Paragraph Font"/>
     <w:uiPriority w:val="1"/>
-    <w:semiHidden/>
     <w:unhideWhenUsed/>
   </w:style>
   <w:style w:type="table" w:default="1" w:styleId="TableNormal">

</xml_diff>